<commit_message>
Lactée: add campaign result note to intention text
Append "La campagne a atteint 150 % de son objectif en vingt-quatre
heures." as a final standalone line under the last paragraph of D-2I
"Lactée, avec amour", on the site and in TEXT/Lactée.docx so both stay
identical.

Co-Authored-By: Claude Opus 5.5 <noreply@anthropic.com>
</commit_message>
<xml_diff>
--- a/TEXT/Lactée.docx
+++ b/TEXT/Lactée.docx
@@ -72,6 +72,30 @@
           <w:bCs w:val="false"/>
         </w:rPr>
         <w:t xml:space="preserve">C'est un film qui ne cherche pas à convaincre. Il montre une personne qui a déjà décidé, et qui porte cette décision avec autant de calme que n'importe quel autre geste du quotidien. On n'a rien eu besoin d'inventer pour que ce soit vrai. Il a juste fallu rester assez longtemps dans la conversation pour voir ce qui était déjà là.</w:t>
+      </w:r>
+    </w:p>
+    <w:p>
+      <w:pPr>
+        <w:spacing w:after="240"/>
+      </w:pPr>
+      <w:r>
+        <w:rPr>
+          <w:b w:val="false"/>
+          <w:bCs w:val="false"/>
+        </w:rPr>
+        <w:t xml:space="preserve"/>
+      </w:r>
+    </w:p>
+    <w:p>
+      <w:pPr>
+        <w:spacing w:after="240"/>
+      </w:pPr>
+      <w:r>
+        <w:rPr>
+          <w:b w:val="false"/>
+          <w:bCs w:val="false"/>
+        </w:rPr>
+        <w:t xml:space="preserve">La campagne a atteint 150 % de son objectif en vingt-quatre heures.</w:t>
       </w:r>
     </w:p>
     <w:p>

</xml_diff>